<commit_message>
docs(gs): 매뉴얼 #4(Web) — BODA.VMS.Web 관리 화면 18장 캡처/삽입
Chrome CDP(Node 24 내장 fetch/WebSocket, npm 불필요)로 admin 로그인 후 SPA
네비게이션하며 Web 관리 화면 자동 캡처 → 매뉴얼 4장 자리표시 교체:
로그인/Dashboard/Alarms/Production History/Work Orders/Products/Inspection
Items/Operators/Maintenance/Defect Codes/Shifts/Audit Logs/Reports(PDF) +
파레토/SPC/OEE/설비신뢰성/불량률예측.

생성기: web_capture.js. 매뉴얼 이미지 26→44장.
미반영: Andon Board(외부 새창 ↗)/Lots(메뉴 미노출) — 후속.

Co-Authored-By: Claude Opus 4.8 (1M context) <noreply@anthropic.com>
</commit_message>
<xml_diff>
--- a/docs/gs/VMS_사용자매뉴얼_v1.0.docx
+++ b/docs/gs/VMS_사용자매뉴얼_v1.0.docx
@@ -8876,22 +8876,76 @@
     </w:p>
     <w:p>
       <w:pPr>
-        <w:pBdr>
-          <w:top w:val="single" w:color="E0B000" w:sz="4"/>
-          <w:bottom w:val="single" w:color="E0B000" w:sz="4"/>
-          <w:left w:val="single" w:color="E0B000" w:sz="4"/>
-          <w:right w:val="single" w:color="E0B000" w:sz="4"/>
-        </w:pBdr>
-        <w:shd w:fill="FFF2CC" w:val="clear"/>
-        <w:spacing w:after="160" w:before="60"/>
+        <w:spacing w:after="100" w:line="276"/>
       </w:pPr>
       <w:r>
         <w:rPr>
-          <w:color w:val="7F6000"/>
+          <w:sz w:val="21"/>
+          <w:szCs w:val="21"/>
+        </w:rPr>
+        <w:t xml:space="preserve">아래는 BODA.VMS.Web(ASP.NET Core 8 + Blazor) 관리 화면이다(Admin 로그인 기준).</w:t>
+      </w:r>
+    </w:p>
+    <w:p>
+      <w:pPr>
+        <w:spacing w:after="40" w:before="80"/>
+        <w:jc w:val="center"/>
+      </w:pPr>
+      <w:r>
+        <w:drawing>
+          <wp:inline distT="0" distB="0" distL="0" distR="0">
+            <wp:extent cx="3429000" cy="1962150"/>
+            <wp:effectExtent t="0" r="0" b="0" l="0"/>
+            <wp:docPr id="1" name="40_web_login.png" descr="40_web_login.png" title="40_web_login.png"/>
+            <wp:cNvGraphicFramePr>
+              <a:graphicFrameLocks xmlns:a="http://schemas.openxmlformats.org/drawingml/2006/main" noChangeAspect="1"/>
+            </wp:cNvGraphicFramePr>
+            <a:graphic xmlns:a="http://schemas.openxmlformats.org/drawingml/2006/main">
+              <a:graphicData uri="http://schemas.openxmlformats.org/drawingml/2006/picture">
+                <pic:pic xmlns:pic="http://schemas.openxmlformats.org/drawingml/2006/picture">
+                  <pic:nvPicPr>
+                    <pic:cNvPr id="0" name="" descr=""/>
+                    <pic:cNvPicPr>
+                      <a:picLocks noChangeAspect="1" noChangeArrowheads="1"/>
+                    </pic:cNvPicPr>
+                  </pic:nvPicPr>
+                  <pic:blipFill>
+                    <a:blip r:embed="rId34" cstate="none"/>
+                    <a:srcRect/>
+                    <a:stretch>
+                      <a:fillRect/>
+                    </a:stretch>
+                  </pic:blipFill>
+                  <pic:spPr bwMode="auto">
+                    <a:xfrm>
+                      <a:off x="0" y="0"/>
+                      <a:ext cx="3429000" cy="1962150"/>
+                    </a:xfrm>
+                    <a:prstGeom prst="rect">
+                      <a:avLst/>
+                    </a:prstGeom>
+                  </pic:spPr>
+                </pic:pic>
+              </a:graphicData>
+            </a:graphic>
+          </wp:inline>
+        </w:drawing>
+      </w:r>
+    </w:p>
+    <w:p>
+      <w:pPr>
+        <w:spacing w:after="160"/>
+        <w:jc w:val="center"/>
+      </w:pPr>
+      <w:r>
+        <w:rPr>
+          <w:i/>
+          <w:iCs/>
+          <w:color w:val="595959"/>
           <w:sz w:val="18"/>
           <w:szCs w:val="18"/>
         </w:rPr>
-        <w:t xml:space="preserve">📷 BODA.VMS.Web 관리 화면(Dashboard / Production History / Work Orders / Alarms / Audit Logs 등) 스크린샷은 Web 서버 실행 환경에서 캡처하여 삽입 예정.</w:t>
+        <w:t xml:space="preserve">그림 4-0. Web 로그인</w:t>
       </w:r>
     </w:p>
     <w:p>
@@ -9484,6 +9538,68 @@
     </w:p>
     <w:p>
       <w:pPr>
+        <w:spacing w:after="40" w:before="80"/>
+        <w:jc w:val="center"/>
+      </w:pPr>
+      <w:r>
+        <w:drawing>
+          <wp:inline distT="0" distB="0" distL="0" distR="0">
+            <wp:extent cx="5715000" cy="3267075"/>
+            <wp:effectExtent t="0" r="0" b="0" l="0"/>
+            <wp:docPr id="1" name="41_web_dashboard.png" descr="41_web_dashboard.png" title="41_web_dashboard.png"/>
+            <wp:cNvGraphicFramePr>
+              <a:graphicFrameLocks xmlns:a="http://schemas.openxmlformats.org/drawingml/2006/main" noChangeAspect="1"/>
+            </wp:cNvGraphicFramePr>
+            <a:graphic xmlns:a="http://schemas.openxmlformats.org/drawingml/2006/main">
+              <a:graphicData uri="http://schemas.openxmlformats.org/drawingml/2006/picture">
+                <pic:pic xmlns:pic="http://schemas.openxmlformats.org/drawingml/2006/picture">
+                  <pic:nvPicPr>
+                    <pic:cNvPr id="0" name="" descr=""/>
+                    <pic:cNvPicPr>
+                      <a:picLocks noChangeAspect="1" noChangeArrowheads="1"/>
+                    </pic:cNvPicPr>
+                  </pic:nvPicPr>
+                  <pic:blipFill>
+                    <a:blip r:embed="rId35" cstate="none"/>
+                    <a:srcRect/>
+                    <a:stretch>
+                      <a:fillRect/>
+                    </a:stretch>
+                  </pic:blipFill>
+                  <pic:spPr bwMode="auto">
+                    <a:xfrm>
+                      <a:off x="0" y="0"/>
+                      <a:ext cx="5715000" cy="3267075"/>
+                    </a:xfrm>
+                    <a:prstGeom prst="rect">
+                      <a:avLst/>
+                    </a:prstGeom>
+                  </pic:spPr>
+                </pic:pic>
+              </a:graphicData>
+            </a:graphic>
+          </wp:inline>
+        </w:drawing>
+      </w:r>
+    </w:p>
+    <w:p>
+      <w:pPr>
+        <w:spacing w:after="160"/>
+        <w:jc w:val="center"/>
+      </w:pPr>
+      <w:r>
+        <w:rPr>
+          <w:i/>
+          <w:iCs/>
+          <w:color w:val="595959"/>
+          <w:sz w:val="18"/>
+          <w:szCs w:val="18"/>
+        </w:rPr>
+        <w:t xml:space="preserve">그림. Dashboard — 현장 KPI(전체 클라이언트/금일 생산·합격/불량률) + 사이드 메뉴</w:t>
+      </w:r>
+    </w:p>
+    <w:p>
+      <w:pPr>
         <w:spacing w:after="100" w:line="276"/>
       </w:pPr>
       <w:r>
@@ -9540,6 +9656,68 @@
       </w:pPr>
       <w:r>
         <w:t xml:space="preserve">4.5 Alarms</w:t>
+      </w:r>
+    </w:p>
+    <w:p>
+      <w:pPr>
+        <w:spacing w:after="40" w:before="80"/>
+        <w:jc w:val="center"/>
+      </w:pPr>
+      <w:r>
+        <w:drawing>
+          <wp:inline distT="0" distB="0" distL="0" distR="0">
+            <wp:extent cx="5715000" cy="3267075"/>
+            <wp:effectExtent t="0" r="0" b="0" l="0"/>
+            <wp:docPr id="1" name="43_web_알람.png" descr="43_web_알람.png" title="43_web_알람.png"/>
+            <wp:cNvGraphicFramePr>
+              <a:graphicFrameLocks xmlns:a="http://schemas.openxmlformats.org/drawingml/2006/main" noChangeAspect="1"/>
+            </wp:cNvGraphicFramePr>
+            <a:graphic xmlns:a="http://schemas.openxmlformats.org/drawingml/2006/main">
+              <a:graphicData uri="http://schemas.openxmlformats.org/drawingml/2006/picture">
+                <pic:pic xmlns:pic="http://schemas.openxmlformats.org/drawingml/2006/picture">
+                  <pic:nvPicPr>
+                    <pic:cNvPr id="0" name="" descr=""/>
+                    <pic:cNvPicPr>
+                      <a:picLocks noChangeAspect="1" noChangeArrowheads="1"/>
+                    </pic:cNvPicPr>
+                  </pic:nvPicPr>
+                  <pic:blipFill>
+                    <a:blip r:embed="rId36" cstate="none"/>
+                    <a:srcRect/>
+                    <a:stretch>
+                      <a:fillRect/>
+                    </a:stretch>
+                  </pic:blipFill>
+                  <pic:spPr bwMode="auto">
+                    <a:xfrm>
+                      <a:off x="0" y="0"/>
+                      <a:ext cx="5715000" cy="3267075"/>
+                    </a:xfrm>
+                    <a:prstGeom prst="rect">
+                      <a:avLst/>
+                    </a:prstGeom>
+                  </pic:spPr>
+                </pic:pic>
+              </a:graphicData>
+            </a:graphic>
+          </wp:inline>
+        </w:drawing>
+      </w:r>
+    </w:p>
+    <w:p>
+      <w:pPr>
+        <w:spacing w:after="160"/>
+        <w:jc w:val="center"/>
+      </w:pPr>
+      <w:r>
+        <w:rPr>
+          <w:i/>
+          <w:iCs/>
+          <w:color w:val="595959"/>
+          <w:sz w:val="18"/>
+          <w:szCs w:val="18"/>
+        </w:rPr>
+        <w:t xml:space="preserve">그림. Alarms — 알람 목록</w:t>
       </w:r>
     </w:p>
     <w:p>
@@ -9623,6 +9801,68 @@
     </w:p>
     <w:p>
       <w:pPr>
+        <w:spacing w:after="40" w:before="80"/>
+        <w:jc w:val="center"/>
+      </w:pPr>
+      <w:r>
+        <w:drawing>
+          <wp:inline distT="0" distB="0" distL="0" distR="0">
+            <wp:extent cx="5715000" cy="3267075"/>
+            <wp:effectExtent t="0" r="0" b="0" l="0"/>
+            <wp:docPr id="1" name="44_web_생산_이력.png" descr="44_web_생산_이력.png" title="44_web_생산_이력.png"/>
+            <wp:cNvGraphicFramePr>
+              <a:graphicFrameLocks xmlns:a="http://schemas.openxmlformats.org/drawingml/2006/main" noChangeAspect="1"/>
+            </wp:cNvGraphicFramePr>
+            <a:graphic xmlns:a="http://schemas.openxmlformats.org/drawingml/2006/main">
+              <a:graphicData uri="http://schemas.openxmlformats.org/drawingml/2006/picture">
+                <pic:pic xmlns:pic="http://schemas.openxmlformats.org/drawingml/2006/picture">
+                  <pic:nvPicPr>
+                    <pic:cNvPr id="0" name="" descr=""/>
+                    <pic:cNvPicPr>
+                      <a:picLocks noChangeAspect="1" noChangeArrowheads="1"/>
+                    </pic:cNvPicPr>
+                  </pic:nvPicPr>
+                  <pic:blipFill>
+                    <a:blip r:embed="rId37" cstate="none"/>
+                    <a:srcRect/>
+                    <a:stretch>
+                      <a:fillRect/>
+                    </a:stretch>
+                  </pic:blipFill>
+                  <pic:spPr bwMode="auto">
+                    <a:xfrm>
+                      <a:off x="0" y="0"/>
+                      <a:ext cx="5715000" cy="3267075"/>
+                    </a:xfrm>
+                    <a:prstGeom prst="rect">
+                      <a:avLst/>
+                    </a:prstGeom>
+                  </pic:spPr>
+                </pic:pic>
+              </a:graphicData>
+            </a:graphic>
+          </wp:inline>
+        </w:drawing>
+      </w:r>
+    </w:p>
+    <w:p>
+      <w:pPr>
+        <w:spacing w:after="160"/>
+        <w:jc w:val="center"/>
+      </w:pPr>
+      <w:r>
+        <w:rPr>
+          <w:i/>
+          <w:iCs/>
+          <w:color w:val="595959"/>
+          <w:sz w:val="18"/>
+          <w:szCs w:val="18"/>
+        </w:rPr>
+        <w:t xml:space="preserve">그림. Production History — 라인/기간/결과 필터, 검사 이력(이미지 포함), Excel 내보내기</w:t>
+      </w:r>
+    </w:p>
+    <w:p>
+      <w:pPr>
         <w:spacing w:after="100" w:line="276"/>
       </w:pPr>
       <w:r>
@@ -9694,6 +9934,68 @@
     </w:p>
     <w:p>
       <w:pPr>
+        <w:spacing w:after="40" w:before="80"/>
+        <w:jc w:val="center"/>
+      </w:pPr>
+      <w:r>
+        <w:drawing>
+          <wp:inline distT="0" distB="0" distL="0" distR="0">
+            <wp:extent cx="5715000" cy="3267075"/>
+            <wp:effectExtent t="0" r="0" b="0" l="0"/>
+            <wp:docPr id="1" name="45_web_작업_지시.png" descr="45_web_작업_지시.png" title="45_web_작업_지시.png"/>
+            <wp:cNvGraphicFramePr>
+              <a:graphicFrameLocks xmlns:a="http://schemas.openxmlformats.org/drawingml/2006/main" noChangeAspect="1"/>
+            </wp:cNvGraphicFramePr>
+            <a:graphic xmlns:a="http://schemas.openxmlformats.org/drawingml/2006/main">
+              <a:graphicData uri="http://schemas.openxmlformats.org/drawingml/2006/picture">
+                <pic:pic xmlns:pic="http://schemas.openxmlformats.org/drawingml/2006/picture">
+                  <pic:nvPicPr>
+                    <pic:cNvPr id="0" name="" descr=""/>
+                    <pic:cNvPicPr>
+                      <a:picLocks noChangeAspect="1" noChangeArrowheads="1"/>
+                    </pic:cNvPicPr>
+                  </pic:nvPicPr>
+                  <pic:blipFill>
+                    <a:blip r:embed="rId38" cstate="none"/>
+                    <a:srcRect/>
+                    <a:stretch>
+                      <a:fillRect/>
+                    </a:stretch>
+                  </pic:blipFill>
+                  <pic:spPr bwMode="auto">
+                    <a:xfrm>
+                      <a:off x="0" y="0"/>
+                      <a:ext cx="5715000" cy="3267075"/>
+                    </a:xfrm>
+                    <a:prstGeom prst="rect">
+                      <a:avLst/>
+                    </a:prstGeom>
+                  </pic:spPr>
+                </pic:pic>
+              </a:graphicData>
+            </a:graphic>
+          </wp:inline>
+        </w:drawing>
+      </w:r>
+    </w:p>
+    <w:p>
+      <w:pPr>
+        <w:spacing w:after="160"/>
+        <w:jc w:val="center"/>
+      </w:pPr>
+      <w:r>
+        <w:rPr>
+          <w:i/>
+          <w:iCs/>
+          <w:color w:val="595959"/>
+          <w:sz w:val="18"/>
+          <w:szCs w:val="18"/>
+        </w:rPr>
+        <w:t xml:space="preserve">그림. Work Orders — 작업지시 목록/관리</w:t>
+      </w:r>
+    </w:p>
+    <w:p>
+      <w:pPr>
         <w:spacing w:after="100" w:line="276"/>
       </w:pPr>
       <w:r>
@@ -9799,6 +10101,68 @@
     </w:p>
     <w:p>
       <w:pPr>
+        <w:spacing w:after="40" w:before="80"/>
+        <w:jc w:val="center"/>
+      </w:pPr>
+      <w:r>
+        <w:drawing>
+          <wp:inline distT="0" distB="0" distL="0" distR="0">
+            <wp:extent cx="5715000" cy="3267075"/>
+            <wp:effectExtent t="0" r="0" b="0" l="0"/>
+            <wp:docPr id="1" name="46_web_제품.png" descr="46_web_제품.png" title="46_web_제품.png"/>
+            <wp:cNvGraphicFramePr>
+              <a:graphicFrameLocks xmlns:a="http://schemas.openxmlformats.org/drawingml/2006/main" noChangeAspect="1"/>
+            </wp:cNvGraphicFramePr>
+            <a:graphic xmlns:a="http://schemas.openxmlformats.org/drawingml/2006/main">
+              <a:graphicData uri="http://schemas.openxmlformats.org/drawingml/2006/picture">
+                <pic:pic xmlns:pic="http://schemas.openxmlformats.org/drawingml/2006/picture">
+                  <pic:nvPicPr>
+                    <pic:cNvPr id="0" name="" descr=""/>
+                    <pic:cNvPicPr>
+                      <a:picLocks noChangeAspect="1" noChangeArrowheads="1"/>
+                    </pic:cNvPicPr>
+                  </pic:nvPicPr>
+                  <pic:blipFill>
+                    <a:blip r:embed="rId39" cstate="none"/>
+                    <a:srcRect/>
+                    <a:stretch>
+                      <a:fillRect/>
+                    </a:stretch>
+                  </pic:blipFill>
+                  <pic:spPr bwMode="auto">
+                    <a:xfrm>
+                      <a:off x="0" y="0"/>
+                      <a:ext cx="5715000" cy="3267075"/>
+                    </a:xfrm>
+                    <a:prstGeom prst="rect">
+                      <a:avLst/>
+                    </a:prstGeom>
+                  </pic:spPr>
+                </pic:pic>
+              </a:graphicData>
+            </a:graphic>
+          </wp:inline>
+        </w:drawing>
+      </w:r>
+    </w:p>
+    <w:p>
+      <w:pPr>
+        <w:spacing w:after="160"/>
+        <w:jc w:val="center"/>
+      </w:pPr>
+      <w:r>
+        <w:rPr>
+          <w:i/>
+          <w:iCs/>
+          <w:color w:val="595959"/>
+          <w:sz w:val="18"/>
+          <w:szCs w:val="18"/>
+        </w:rPr>
+        <w:t xml:space="preserve">그림. Products — 제품 관리</w:t>
+      </w:r>
+    </w:p>
+    <w:p>
+      <w:pPr>
         <w:spacing w:after="100" w:line="276"/>
       </w:pPr>
       <w:r>
@@ -9815,6 +10179,68 @@
       </w:pPr>
       <w:r>
         <w:t xml:space="preserve">4.9 Inspection Items (Recipes + Parameters)</w:t>
+      </w:r>
+    </w:p>
+    <w:p>
+      <w:pPr>
+        <w:spacing w:after="40" w:before="80"/>
+        <w:jc w:val="center"/>
+      </w:pPr>
+      <w:r>
+        <w:drawing>
+          <wp:inline distT="0" distB="0" distL="0" distR="0">
+            <wp:extent cx="5715000" cy="3267075"/>
+            <wp:effectExtent t="0" r="0" b="0" l="0"/>
+            <wp:docPr id="1" name="58_web_검사_항목.png" descr="58_web_검사_항목.png" title="58_web_검사_항목.png"/>
+            <wp:cNvGraphicFramePr>
+              <a:graphicFrameLocks xmlns:a="http://schemas.openxmlformats.org/drawingml/2006/main" noChangeAspect="1"/>
+            </wp:cNvGraphicFramePr>
+            <a:graphic xmlns:a="http://schemas.openxmlformats.org/drawingml/2006/main">
+              <a:graphicData uri="http://schemas.openxmlformats.org/drawingml/2006/picture">
+                <pic:pic xmlns:pic="http://schemas.openxmlformats.org/drawingml/2006/picture">
+                  <pic:nvPicPr>
+                    <pic:cNvPr id="0" name="" descr=""/>
+                    <pic:cNvPicPr>
+                      <a:picLocks noChangeAspect="1" noChangeArrowheads="1"/>
+                    </pic:cNvPicPr>
+                  </pic:nvPicPr>
+                  <pic:blipFill>
+                    <a:blip r:embed="rId40" cstate="none"/>
+                    <a:srcRect/>
+                    <a:stretch>
+                      <a:fillRect/>
+                    </a:stretch>
+                  </pic:blipFill>
+                  <pic:spPr bwMode="auto">
+                    <a:xfrm>
+                      <a:off x="0" y="0"/>
+                      <a:ext cx="5715000" cy="3267075"/>
+                    </a:xfrm>
+                    <a:prstGeom prst="rect">
+                      <a:avLst/>
+                    </a:prstGeom>
+                  </pic:spPr>
+                </pic:pic>
+              </a:graphicData>
+            </a:graphic>
+          </wp:inline>
+        </w:drawing>
+      </w:r>
+    </w:p>
+    <w:p>
+      <w:pPr>
+        <w:spacing w:after="160"/>
+        <w:jc w:val="center"/>
+      </w:pPr>
+      <w:r>
+        <w:rPr>
+          <w:i/>
+          <w:iCs/>
+          <w:color w:val="595959"/>
+          <w:sz w:val="18"/>
+          <w:szCs w:val="18"/>
+        </w:rPr>
+        <w:t xml:space="preserve">그림. Inspection Items — 검사 항목(레시피/파라미터)</w:t>
       </w:r>
     </w:p>
     <w:p>
@@ -9886,6 +10312,68 @@
       </w:pPr>
       <w:r>
         <w:t xml:space="preserve">4.10 Operators</w:t>
+      </w:r>
+    </w:p>
+    <w:p>
+      <w:pPr>
+        <w:spacing w:after="40" w:before="80"/>
+        <w:jc w:val="center"/>
+      </w:pPr>
+      <w:r>
+        <w:drawing>
+          <wp:inline distT="0" distB="0" distL="0" distR="0">
+            <wp:extent cx="5715000" cy="3267075"/>
+            <wp:effectExtent t="0" r="0" b="0" l="0"/>
+            <wp:docPr id="1" name="47_web_작업자.png" descr="47_web_작업자.png" title="47_web_작업자.png"/>
+            <wp:cNvGraphicFramePr>
+              <a:graphicFrameLocks xmlns:a="http://schemas.openxmlformats.org/drawingml/2006/main" noChangeAspect="1"/>
+            </wp:cNvGraphicFramePr>
+            <a:graphic xmlns:a="http://schemas.openxmlformats.org/drawingml/2006/main">
+              <a:graphicData uri="http://schemas.openxmlformats.org/drawingml/2006/picture">
+                <pic:pic xmlns:pic="http://schemas.openxmlformats.org/drawingml/2006/picture">
+                  <pic:nvPicPr>
+                    <pic:cNvPr id="0" name="" descr=""/>
+                    <pic:cNvPicPr>
+                      <a:picLocks noChangeAspect="1" noChangeArrowheads="1"/>
+                    </pic:cNvPicPr>
+                  </pic:nvPicPr>
+                  <pic:blipFill>
+                    <a:blip r:embed="rId41" cstate="none"/>
+                    <a:srcRect/>
+                    <a:stretch>
+                      <a:fillRect/>
+                    </a:stretch>
+                  </pic:blipFill>
+                  <pic:spPr bwMode="auto">
+                    <a:xfrm>
+                      <a:off x="0" y="0"/>
+                      <a:ext cx="5715000" cy="3267075"/>
+                    </a:xfrm>
+                    <a:prstGeom prst="rect">
+                      <a:avLst/>
+                    </a:prstGeom>
+                  </pic:spPr>
+                </pic:pic>
+              </a:graphicData>
+            </a:graphic>
+          </wp:inline>
+        </w:drawing>
+      </w:r>
+    </w:p>
+    <w:p>
+      <w:pPr>
+        <w:spacing w:after="160"/>
+        <w:jc w:val="center"/>
+      </w:pPr>
+      <w:r>
+        <w:rPr>
+          <w:i/>
+          <w:iCs/>
+          <w:color w:val="595959"/>
+          <w:sz w:val="18"/>
+          <w:szCs w:val="18"/>
+        </w:rPr>
+        <w:t xml:space="preserve">그림. Operators — 작업자 관리</w:t>
       </w:r>
     </w:p>
     <w:p>
@@ -10442,6 +10930,68 @@
     </w:p>
     <w:p>
       <w:pPr>
+        <w:spacing w:after="40" w:before="80"/>
+        <w:jc w:val="center"/>
+      </w:pPr>
+      <w:r>
+        <w:drawing>
+          <wp:inline distT="0" distB="0" distL="0" distR="0">
+            <wp:extent cx="5715000" cy="3267075"/>
+            <wp:effectExtent t="0" r="0" b="0" l="0"/>
+            <wp:docPr id="1" name="56_web_예방_보전.png" descr="56_web_예방_보전.png" title="56_web_예방_보전.png"/>
+            <wp:cNvGraphicFramePr>
+              <a:graphicFrameLocks xmlns:a="http://schemas.openxmlformats.org/drawingml/2006/main" noChangeAspect="1"/>
+            </wp:cNvGraphicFramePr>
+            <a:graphic xmlns:a="http://schemas.openxmlformats.org/drawingml/2006/main">
+              <a:graphicData uri="http://schemas.openxmlformats.org/drawingml/2006/picture">
+                <pic:pic xmlns:pic="http://schemas.openxmlformats.org/drawingml/2006/picture">
+                  <pic:nvPicPr>
+                    <pic:cNvPr id="0" name="" descr=""/>
+                    <pic:cNvPicPr>
+                      <a:picLocks noChangeAspect="1" noChangeArrowheads="1"/>
+                    </pic:cNvPicPr>
+                  </pic:nvPicPr>
+                  <pic:blipFill>
+                    <a:blip r:embed="rId42" cstate="none"/>
+                    <a:srcRect/>
+                    <a:stretch>
+                      <a:fillRect/>
+                    </a:stretch>
+                  </pic:blipFill>
+                  <pic:spPr bwMode="auto">
+                    <a:xfrm>
+                      <a:off x="0" y="0"/>
+                      <a:ext cx="5715000" cy="3267075"/>
+                    </a:xfrm>
+                    <a:prstGeom prst="rect">
+                      <a:avLst/>
+                    </a:prstGeom>
+                  </pic:spPr>
+                </pic:pic>
+              </a:graphicData>
+            </a:graphic>
+          </wp:inline>
+        </w:drawing>
+      </w:r>
+    </w:p>
+    <w:p>
+      <w:pPr>
+        <w:spacing w:after="160"/>
+        <w:jc w:val="center"/>
+      </w:pPr>
+      <w:r>
+        <w:rPr>
+          <w:i/>
+          <w:iCs/>
+          <w:color w:val="595959"/>
+          <w:sz w:val="18"/>
+          <w:szCs w:val="18"/>
+        </w:rPr>
+        <w:t xml:space="preserve">그림. Maintenance — 예방 보전</w:t>
+      </w:r>
+    </w:p>
+    <w:p>
+      <w:pPr>
         <w:spacing w:after="100" w:line="276"/>
       </w:pPr>
       <w:r>
@@ -10462,6 +11012,68 @@
     </w:p>
     <w:p>
       <w:pPr>
+        <w:spacing w:after="40" w:before="80"/>
+        <w:jc w:val="center"/>
+      </w:pPr>
+      <w:r>
+        <w:drawing>
+          <wp:inline distT="0" distB="0" distL="0" distR="0">
+            <wp:extent cx="5715000" cy="3267075"/>
+            <wp:effectExtent t="0" r="0" b="0" l="0"/>
+            <wp:docPr id="1" name="50_web_불량_코드.png" descr="50_web_불량_코드.png" title="50_web_불량_코드.png"/>
+            <wp:cNvGraphicFramePr>
+              <a:graphicFrameLocks xmlns:a="http://schemas.openxmlformats.org/drawingml/2006/main" noChangeAspect="1"/>
+            </wp:cNvGraphicFramePr>
+            <a:graphic xmlns:a="http://schemas.openxmlformats.org/drawingml/2006/main">
+              <a:graphicData uri="http://schemas.openxmlformats.org/drawingml/2006/picture">
+                <pic:pic xmlns:pic="http://schemas.openxmlformats.org/drawingml/2006/picture">
+                  <pic:nvPicPr>
+                    <pic:cNvPr id="0" name="" descr=""/>
+                    <pic:cNvPicPr>
+                      <a:picLocks noChangeAspect="1" noChangeArrowheads="1"/>
+                    </pic:cNvPicPr>
+                  </pic:nvPicPr>
+                  <pic:blipFill>
+                    <a:blip r:embed="rId43" cstate="none"/>
+                    <a:srcRect/>
+                    <a:stretch>
+                      <a:fillRect/>
+                    </a:stretch>
+                  </pic:blipFill>
+                  <pic:spPr bwMode="auto">
+                    <a:xfrm>
+                      <a:off x="0" y="0"/>
+                      <a:ext cx="5715000" cy="3267075"/>
+                    </a:xfrm>
+                    <a:prstGeom prst="rect">
+                      <a:avLst/>
+                    </a:prstGeom>
+                  </pic:spPr>
+                </pic:pic>
+              </a:graphicData>
+            </a:graphic>
+          </wp:inline>
+        </w:drawing>
+      </w:r>
+    </w:p>
+    <w:p>
+      <w:pPr>
+        <w:spacing w:after="160"/>
+        <w:jc w:val="center"/>
+      </w:pPr>
+      <w:r>
+        <w:rPr>
+          <w:i/>
+          <w:iCs/>
+          <w:color w:val="595959"/>
+          <w:sz w:val="18"/>
+          <w:szCs w:val="18"/>
+        </w:rPr>
+        <w:t xml:space="preserve">그림. Defect Codes — 불량 코드 관리</w:t>
+      </w:r>
+    </w:p>
+    <w:p>
+      <w:pPr>
         <w:spacing w:after="100" w:line="276"/>
       </w:pPr>
       <w:r>
@@ -10482,6 +11094,68 @@
     </w:p>
     <w:p>
       <w:pPr>
+        <w:spacing w:after="40" w:before="80"/>
+        <w:jc w:val="center"/>
+      </w:pPr>
+      <w:r>
+        <w:drawing>
+          <wp:inline distT="0" distB="0" distL="0" distR="0">
+            <wp:extent cx="5715000" cy="3267075"/>
+            <wp:effectExtent t="0" r="0" b="0" l="0"/>
+            <wp:docPr id="1" name="59_web_교대_마스터.png" descr="59_web_교대_마스터.png" title="59_web_교대_마스터.png"/>
+            <wp:cNvGraphicFramePr>
+              <a:graphicFrameLocks xmlns:a="http://schemas.openxmlformats.org/drawingml/2006/main" noChangeAspect="1"/>
+            </wp:cNvGraphicFramePr>
+            <a:graphic xmlns:a="http://schemas.openxmlformats.org/drawingml/2006/main">
+              <a:graphicData uri="http://schemas.openxmlformats.org/drawingml/2006/picture">
+                <pic:pic xmlns:pic="http://schemas.openxmlformats.org/drawingml/2006/picture">
+                  <pic:nvPicPr>
+                    <pic:cNvPr id="0" name="" descr=""/>
+                    <pic:cNvPicPr>
+                      <a:picLocks noChangeAspect="1" noChangeArrowheads="1"/>
+                    </pic:cNvPicPr>
+                  </pic:nvPicPr>
+                  <pic:blipFill>
+                    <a:blip r:embed="rId44" cstate="none"/>
+                    <a:srcRect/>
+                    <a:stretch>
+                      <a:fillRect/>
+                    </a:stretch>
+                  </pic:blipFill>
+                  <pic:spPr bwMode="auto">
+                    <a:xfrm>
+                      <a:off x="0" y="0"/>
+                      <a:ext cx="5715000" cy="3267075"/>
+                    </a:xfrm>
+                    <a:prstGeom prst="rect">
+                      <a:avLst/>
+                    </a:prstGeom>
+                  </pic:spPr>
+                </pic:pic>
+              </a:graphicData>
+            </a:graphic>
+          </wp:inline>
+        </w:drawing>
+      </w:r>
+    </w:p>
+    <w:p>
+      <w:pPr>
+        <w:spacing w:after="160"/>
+        <w:jc w:val="center"/>
+      </w:pPr>
+      <w:r>
+        <w:rPr>
+          <w:i/>
+          <w:iCs/>
+          <w:color w:val="595959"/>
+          <w:sz w:val="18"/>
+          <w:szCs w:val="18"/>
+        </w:rPr>
+        <w:t xml:space="preserve">그림. Shifts — 교대 마스터</w:t>
+      </w:r>
+    </w:p>
+    <w:p>
+      <w:pPr>
         <w:spacing w:after="100" w:line="276"/>
       </w:pPr>
       <w:r>
@@ -10502,6 +11176,68 @@
     </w:p>
     <w:p>
       <w:pPr>
+        <w:spacing w:after="40" w:before="80"/>
+        <w:jc w:val="center"/>
+      </w:pPr>
+      <w:r>
+        <w:drawing>
+          <wp:inline distT="0" distB="0" distL="0" distR="0">
+            <wp:extent cx="5715000" cy="3267075"/>
+            <wp:effectExtent t="0" r="0" b="0" l="0"/>
+            <wp:docPr id="1" name="61_web_감사_로그.png" descr="61_web_감사_로그.png" title="61_web_감사_로그.png"/>
+            <wp:cNvGraphicFramePr>
+              <a:graphicFrameLocks xmlns:a="http://schemas.openxmlformats.org/drawingml/2006/main" noChangeAspect="1"/>
+            </wp:cNvGraphicFramePr>
+            <a:graphic xmlns:a="http://schemas.openxmlformats.org/drawingml/2006/main">
+              <a:graphicData uri="http://schemas.openxmlformats.org/drawingml/2006/picture">
+                <pic:pic xmlns:pic="http://schemas.openxmlformats.org/drawingml/2006/picture">
+                  <pic:nvPicPr>
+                    <pic:cNvPr id="0" name="" descr=""/>
+                    <pic:cNvPicPr>
+                      <a:picLocks noChangeAspect="1" noChangeArrowheads="1"/>
+                    </pic:cNvPicPr>
+                  </pic:nvPicPr>
+                  <pic:blipFill>
+                    <a:blip r:embed="rId45" cstate="none"/>
+                    <a:srcRect/>
+                    <a:stretch>
+                      <a:fillRect/>
+                    </a:stretch>
+                  </pic:blipFill>
+                  <pic:spPr bwMode="auto">
+                    <a:xfrm>
+                      <a:off x="0" y="0"/>
+                      <a:ext cx="5715000" cy="3267075"/>
+                    </a:xfrm>
+                    <a:prstGeom prst="rect">
+                      <a:avLst/>
+                    </a:prstGeom>
+                  </pic:spPr>
+                </pic:pic>
+              </a:graphicData>
+            </a:graphic>
+          </wp:inline>
+        </w:drawing>
+      </w:r>
+    </w:p>
+    <w:p>
+      <w:pPr>
+        <w:spacing w:after="160"/>
+        <w:jc w:val="center"/>
+      </w:pPr>
+      <w:r>
+        <w:rPr>
+          <w:i/>
+          <w:iCs/>
+          <w:color w:val="595959"/>
+          <w:sz w:val="18"/>
+          <w:szCs w:val="18"/>
+        </w:rPr>
+        <w:t xml:space="preserve">그림. Audit Logs — 감사 로그</w:t>
+      </w:r>
+    </w:p>
+    <w:p>
+      <w:pPr>
         <w:spacing w:after="100" w:line="276"/>
       </w:pPr>
       <w:r>
@@ -10528,6 +11264,378 @@
       </w:pPr>
       <w:r>
         <w:t xml:space="preserve">4.16 Reports / Quality Analysis</w:t>
+      </w:r>
+    </w:p>
+    <w:p>
+      <w:pPr>
+        <w:spacing w:after="40" w:before="80"/>
+        <w:jc w:val="center"/>
+      </w:pPr>
+      <w:r>
+        <w:drawing>
+          <wp:inline distT="0" distB="0" distL="0" distR="0">
+            <wp:extent cx="5715000" cy="3267075"/>
+            <wp:effectExtent t="0" r="0" b="0" l="0"/>
+            <wp:docPr id="1" name="52_web_PDF_리포트.png" descr="52_web_PDF_리포트.png" title="52_web_PDF_리포트.png"/>
+            <wp:cNvGraphicFramePr>
+              <a:graphicFrameLocks xmlns:a="http://schemas.openxmlformats.org/drawingml/2006/main" noChangeAspect="1"/>
+            </wp:cNvGraphicFramePr>
+            <a:graphic xmlns:a="http://schemas.openxmlformats.org/drawingml/2006/main">
+              <a:graphicData uri="http://schemas.openxmlformats.org/drawingml/2006/picture">
+                <pic:pic xmlns:pic="http://schemas.openxmlformats.org/drawingml/2006/picture">
+                  <pic:nvPicPr>
+                    <pic:cNvPr id="0" name="" descr=""/>
+                    <pic:cNvPicPr>
+                      <a:picLocks noChangeAspect="1" noChangeArrowheads="1"/>
+                    </pic:cNvPicPr>
+                  </pic:nvPicPr>
+                  <pic:blipFill>
+                    <a:blip r:embed="rId46" cstate="none"/>
+                    <a:srcRect/>
+                    <a:stretch>
+                      <a:fillRect/>
+                    </a:stretch>
+                  </pic:blipFill>
+                  <pic:spPr bwMode="auto">
+                    <a:xfrm>
+                      <a:off x="0" y="0"/>
+                      <a:ext cx="5715000" cy="3267075"/>
+                    </a:xfrm>
+                    <a:prstGeom prst="rect">
+                      <a:avLst/>
+                    </a:prstGeom>
+                  </pic:spPr>
+                </pic:pic>
+              </a:graphicData>
+            </a:graphic>
+          </wp:inline>
+        </w:drawing>
+      </w:r>
+    </w:p>
+    <w:p>
+      <w:pPr>
+        <w:spacing w:after="160"/>
+        <w:jc w:val="center"/>
+      </w:pPr>
+      <w:r>
+        <w:rPr>
+          <w:i/>
+          <w:iCs/>
+          <w:color w:val="595959"/>
+          <w:sz w:val="18"/>
+          <w:szCs w:val="18"/>
+        </w:rPr>
+        <w:t xml:space="preserve">그림. PDF 리포트</w:t>
+      </w:r>
+    </w:p>
+    <w:p>
+      <w:pPr>
+        <w:spacing w:after="40" w:before="80"/>
+        <w:jc w:val="center"/>
+      </w:pPr>
+      <w:r>
+        <w:drawing>
+          <wp:inline distT="0" distB="0" distL="0" distR="0">
+            <wp:extent cx="5334000" cy="3048000"/>
+            <wp:effectExtent t="0" r="0" b="0" l="0"/>
+            <wp:docPr id="1" name="48_web_파레토_분석.png" descr="48_web_파레토_분석.png" title="48_web_파레토_분석.png"/>
+            <wp:cNvGraphicFramePr>
+              <a:graphicFrameLocks xmlns:a="http://schemas.openxmlformats.org/drawingml/2006/main" noChangeAspect="1"/>
+            </wp:cNvGraphicFramePr>
+            <a:graphic xmlns:a="http://schemas.openxmlformats.org/drawingml/2006/main">
+              <a:graphicData uri="http://schemas.openxmlformats.org/drawingml/2006/picture">
+                <pic:pic xmlns:pic="http://schemas.openxmlformats.org/drawingml/2006/picture">
+                  <pic:nvPicPr>
+                    <pic:cNvPr id="0" name="" descr=""/>
+                    <pic:cNvPicPr>
+                      <a:picLocks noChangeAspect="1" noChangeArrowheads="1"/>
+                    </pic:cNvPicPr>
+                  </pic:nvPicPr>
+                  <pic:blipFill>
+                    <a:blip r:embed="rId47" cstate="none"/>
+                    <a:srcRect/>
+                    <a:stretch>
+                      <a:fillRect/>
+                    </a:stretch>
+                  </pic:blipFill>
+                  <pic:spPr bwMode="auto">
+                    <a:xfrm>
+                      <a:off x="0" y="0"/>
+                      <a:ext cx="5334000" cy="3048000"/>
+                    </a:xfrm>
+                    <a:prstGeom prst="rect">
+                      <a:avLst/>
+                    </a:prstGeom>
+                  </pic:spPr>
+                </pic:pic>
+              </a:graphicData>
+            </a:graphic>
+          </wp:inline>
+        </w:drawing>
+      </w:r>
+    </w:p>
+    <w:p>
+      <w:pPr>
+        <w:spacing w:after="160"/>
+        <w:jc w:val="center"/>
+      </w:pPr>
+      <w:r>
+        <w:rPr>
+          <w:i/>
+          <w:iCs/>
+          <w:color w:val="595959"/>
+          <w:sz w:val="18"/>
+          <w:szCs w:val="18"/>
+        </w:rPr>
+        <w:t xml:space="preserve">그림. 파레토 분석</w:t>
+      </w:r>
+    </w:p>
+    <w:p>
+      <w:pPr>
+        <w:spacing w:after="40" w:before="80"/>
+        <w:jc w:val="center"/>
+      </w:pPr>
+      <w:r>
+        <w:drawing>
+          <wp:inline distT="0" distB="0" distL="0" distR="0">
+            <wp:extent cx="5334000" cy="3048000"/>
+            <wp:effectExtent t="0" r="0" b="0" l="0"/>
+            <wp:docPr id="1" name="49_web_SPC_관리도.png" descr="49_web_SPC_관리도.png" title="49_web_SPC_관리도.png"/>
+            <wp:cNvGraphicFramePr>
+              <a:graphicFrameLocks xmlns:a="http://schemas.openxmlformats.org/drawingml/2006/main" noChangeAspect="1"/>
+            </wp:cNvGraphicFramePr>
+            <a:graphic xmlns:a="http://schemas.openxmlformats.org/drawingml/2006/main">
+              <a:graphicData uri="http://schemas.openxmlformats.org/drawingml/2006/picture">
+                <pic:pic xmlns:pic="http://schemas.openxmlformats.org/drawingml/2006/picture">
+                  <pic:nvPicPr>
+                    <pic:cNvPr id="0" name="" descr=""/>
+                    <pic:cNvPicPr>
+                      <a:picLocks noChangeAspect="1" noChangeArrowheads="1"/>
+                    </pic:cNvPicPr>
+                  </pic:nvPicPr>
+                  <pic:blipFill>
+                    <a:blip r:embed="rId48" cstate="none"/>
+                    <a:srcRect/>
+                    <a:stretch>
+                      <a:fillRect/>
+                    </a:stretch>
+                  </pic:blipFill>
+                  <pic:spPr bwMode="auto">
+                    <a:xfrm>
+                      <a:off x="0" y="0"/>
+                      <a:ext cx="5334000" cy="3048000"/>
+                    </a:xfrm>
+                    <a:prstGeom prst="rect">
+                      <a:avLst/>
+                    </a:prstGeom>
+                  </pic:spPr>
+                </pic:pic>
+              </a:graphicData>
+            </a:graphic>
+          </wp:inline>
+        </w:drawing>
+      </w:r>
+    </w:p>
+    <w:p>
+      <w:pPr>
+        <w:spacing w:after="160"/>
+        <w:jc w:val="center"/>
+      </w:pPr>
+      <w:r>
+        <w:rPr>
+          <w:i/>
+          <w:iCs/>
+          <w:color w:val="595959"/>
+          <w:sz w:val="18"/>
+          <w:szCs w:val="18"/>
+        </w:rPr>
+        <w:t xml:space="preserve">그림. SPC 관리도</w:t>
+      </w:r>
+    </w:p>
+    <w:p>
+      <w:pPr>
+        <w:spacing w:after="40" w:before="80"/>
+        <w:jc w:val="center"/>
+      </w:pPr>
+      <w:r>
+        <w:drawing>
+          <wp:inline distT="0" distB="0" distL="0" distR="0">
+            <wp:extent cx="5334000" cy="3048000"/>
+            <wp:effectExtent t="0" r="0" b="0" l="0"/>
+            <wp:docPr id="1" name="54_web_OEE_설비종합효율.png" descr="54_web_OEE_설비종합효율.png" title="54_web_OEE_설비종합효율.png"/>
+            <wp:cNvGraphicFramePr>
+              <a:graphicFrameLocks xmlns:a="http://schemas.openxmlformats.org/drawingml/2006/main" noChangeAspect="1"/>
+            </wp:cNvGraphicFramePr>
+            <a:graphic xmlns:a="http://schemas.openxmlformats.org/drawingml/2006/main">
+              <a:graphicData uri="http://schemas.openxmlformats.org/drawingml/2006/picture">
+                <pic:pic xmlns:pic="http://schemas.openxmlformats.org/drawingml/2006/picture">
+                  <pic:nvPicPr>
+                    <pic:cNvPr id="0" name="" descr=""/>
+                    <pic:cNvPicPr>
+                      <a:picLocks noChangeAspect="1" noChangeArrowheads="1"/>
+                    </pic:cNvPicPr>
+                  </pic:nvPicPr>
+                  <pic:blipFill>
+                    <a:blip r:embed="rId49" cstate="none"/>
+                    <a:srcRect/>
+                    <a:stretch>
+                      <a:fillRect/>
+                    </a:stretch>
+                  </pic:blipFill>
+                  <pic:spPr bwMode="auto">
+                    <a:xfrm>
+                      <a:off x="0" y="0"/>
+                      <a:ext cx="5334000" cy="3048000"/>
+                    </a:xfrm>
+                    <a:prstGeom prst="rect">
+                      <a:avLst/>
+                    </a:prstGeom>
+                  </pic:spPr>
+                </pic:pic>
+              </a:graphicData>
+            </a:graphic>
+          </wp:inline>
+        </w:drawing>
+      </w:r>
+    </w:p>
+    <w:p>
+      <w:pPr>
+        <w:spacing w:after="160"/>
+        <w:jc w:val="center"/>
+      </w:pPr>
+      <w:r>
+        <w:rPr>
+          <w:i/>
+          <w:iCs/>
+          <w:color w:val="595959"/>
+          <w:sz w:val="18"/>
+          <w:szCs w:val="18"/>
+        </w:rPr>
+        <w:t xml:space="preserve">그림. OEE 설비종합효율</w:t>
+      </w:r>
+    </w:p>
+    <w:p>
+      <w:pPr>
+        <w:spacing w:after="40" w:before="80"/>
+        <w:jc w:val="center"/>
+      </w:pPr>
+      <w:r>
+        <w:drawing>
+          <wp:inline distT="0" distB="0" distL="0" distR="0">
+            <wp:extent cx="5334000" cy="3048000"/>
+            <wp:effectExtent t="0" r="0" b="0" l="0"/>
+            <wp:docPr id="1" name="55_web_설비_신뢰성_MTBF_MTTR.png" descr="55_web_설비_신뢰성_MTBF_MTTR.png" title="55_web_설비_신뢰성_MTBF_MTTR.png"/>
+            <wp:cNvGraphicFramePr>
+              <a:graphicFrameLocks xmlns:a="http://schemas.openxmlformats.org/drawingml/2006/main" noChangeAspect="1"/>
+            </wp:cNvGraphicFramePr>
+            <a:graphic xmlns:a="http://schemas.openxmlformats.org/drawingml/2006/main">
+              <a:graphicData uri="http://schemas.openxmlformats.org/drawingml/2006/picture">
+                <pic:pic xmlns:pic="http://schemas.openxmlformats.org/drawingml/2006/picture">
+                  <pic:nvPicPr>
+                    <pic:cNvPr id="0" name="" descr=""/>
+                    <pic:cNvPicPr>
+                      <a:picLocks noChangeAspect="1" noChangeArrowheads="1"/>
+                    </pic:cNvPicPr>
+                  </pic:nvPicPr>
+                  <pic:blipFill>
+                    <a:blip r:embed="rId50" cstate="none"/>
+                    <a:srcRect/>
+                    <a:stretch>
+                      <a:fillRect/>
+                    </a:stretch>
+                  </pic:blipFill>
+                  <pic:spPr bwMode="auto">
+                    <a:xfrm>
+                      <a:off x="0" y="0"/>
+                      <a:ext cx="5334000" cy="3048000"/>
+                    </a:xfrm>
+                    <a:prstGeom prst="rect">
+                      <a:avLst/>
+                    </a:prstGeom>
+                  </pic:spPr>
+                </pic:pic>
+              </a:graphicData>
+            </a:graphic>
+          </wp:inline>
+        </w:drawing>
+      </w:r>
+    </w:p>
+    <w:p>
+      <w:pPr>
+        <w:spacing w:after="160"/>
+        <w:jc w:val="center"/>
+      </w:pPr>
+      <w:r>
+        <w:rPr>
+          <w:i/>
+          <w:iCs/>
+          <w:color w:val="595959"/>
+          <w:sz w:val="18"/>
+          <w:szCs w:val="18"/>
+        </w:rPr>
+        <w:t xml:space="preserve">그림. 설비 신뢰성 (MTBF/MTTR)</w:t>
+      </w:r>
+    </w:p>
+    <w:p>
+      <w:pPr>
+        <w:spacing w:after="40" w:before="80"/>
+        <w:jc w:val="center"/>
+      </w:pPr>
+      <w:r>
+        <w:drawing>
+          <wp:inline distT="0" distB="0" distL="0" distR="0">
+            <wp:extent cx="5334000" cy="3048000"/>
+            <wp:effectExtent t="0" r="0" b="0" l="0"/>
+            <wp:docPr id="1" name="57_web_불량률_예측.png" descr="57_web_불량률_예측.png" title="57_web_불량률_예측.png"/>
+            <wp:cNvGraphicFramePr>
+              <a:graphicFrameLocks xmlns:a="http://schemas.openxmlformats.org/drawingml/2006/main" noChangeAspect="1"/>
+            </wp:cNvGraphicFramePr>
+            <a:graphic xmlns:a="http://schemas.openxmlformats.org/drawingml/2006/main">
+              <a:graphicData uri="http://schemas.openxmlformats.org/drawingml/2006/picture">
+                <pic:pic xmlns:pic="http://schemas.openxmlformats.org/drawingml/2006/picture">
+                  <pic:nvPicPr>
+                    <pic:cNvPr id="0" name="" descr=""/>
+                    <pic:cNvPicPr>
+                      <a:picLocks noChangeAspect="1" noChangeArrowheads="1"/>
+                    </pic:cNvPicPr>
+                  </pic:nvPicPr>
+                  <pic:blipFill>
+                    <a:blip r:embed="rId51" cstate="none"/>
+                    <a:srcRect/>
+                    <a:stretch>
+                      <a:fillRect/>
+                    </a:stretch>
+                  </pic:blipFill>
+                  <pic:spPr bwMode="auto">
+                    <a:xfrm>
+                      <a:off x="0" y="0"/>
+                      <a:ext cx="5334000" cy="3048000"/>
+                    </a:xfrm>
+                    <a:prstGeom prst="rect">
+                      <a:avLst/>
+                    </a:prstGeom>
+                  </pic:spPr>
+                </pic:pic>
+              </a:graphicData>
+            </a:graphic>
+          </wp:inline>
+        </w:drawing>
+      </w:r>
+    </w:p>
+    <w:p>
+      <w:pPr>
+        <w:spacing w:after="160"/>
+        <w:jc w:val="center"/>
+      </w:pPr>
+      <w:r>
+        <w:rPr>
+          <w:i/>
+          <w:iCs/>
+          <w:color w:val="595959"/>
+          <w:sz w:val="18"/>
+          <w:szCs w:val="18"/>
+        </w:rPr>
+        <w:t xml:space="preserve">그림. 불량률 예측</w:t>
       </w:r>
     </w:p>
     <w:p>

</xml_diff>